<commit_message>
fix(c02): remedieri copy aprobate ARHITECT (corect -> memorabil)
Doar copy, zero structura/arhitectura:
- H1: "Valid pentru Excel. Greșit pentru realitate."
- Mantra: "Nu luăm valorile de bune. Le confruntăm cu realitatea."
- Competenta (DUPA C02 POTI): "Separi ce e valid de ce e corect, in cateva minute."
- WOW: "Excel acceptă orice. De acum, tu nu." (toate 4 HTML + FILM)
- Regula oficiala introdusa explicit in cover-miza: "Excel acceptă
  valoarea. Business-ul o investighează."

Eliminat reziduul MARCARE din DUPA C02 POTI. FILM: mantra + WOW aliniate.
Filmname (R-V58) sigur: stem "contr" ramane in topbar/footer. GATE PASS. ZERO DRIFT.

https://claude.ai/code/session_01LyAPoAAQGLZmsidsR6PmjW
</commit_message>
<xml_diff>
--- a/c02/FILM-Excel-02-Control.docx
+++ b/c02/FILM-Excel-02-Control.docx
@@ -116,7 +116,7 @@
           <w:rFonts w:ascii="Calibri" w:hAnsi="Calibri"/>
           <w:sz w:val="20"/>
         </w:rPr>
-        <w:t>Nu credem valorile. Le confruntăm cu realitatea.</w:t>
+        <w:t>Nu luăm valorile de bune. Le confruntăm cu realitatea.</w:t>
       </w:r>
     </w:p>
     <w:p>
@@ -140,7 +140,7 @@
           <w:rFonts w:ascii="Calibri" w:hAnsi="Calibri"/>
           <w:sz w:val="20"/>
         </w:rPr>
-        <w:t>Excel acceptă orice valoare validă. Acum ai aparatul care întreabă dacă e și corectă.</w:t>
+        <w:t>Excel acceptă orice. De acum, tu nu.</w:t>
       </w:r>
     </w:p>
     <w:p>

</xml_diff>

<commit_message>
feat(c02): rescrie corp FILM C02 - voce CONTROL diferentiata per etapa
STARE EMOTIONALA + VOCEA TRAINERULUI + DEMONSTRATIA + INTERVENTIA AI +
MOMENT DE CONTROL + REVEAL rescrise pentru toate cele 6 etape.
Boilerplate generic inlocuit cu voce specifica C02 CONTROL:
- E1 REALITATE: nomenclatoare deschise, 5 coloane goale, martorul fixat
- E2 INVESTIGATIE: promptul 1, raport AI 155 semnale pe 5 categorii
- E3 TRANSFORMARE: XLOOKUP/COUNTIF/NETWORKDAYS.INTL, coloane semnalizare
- E4 VERIFICARE: COUNTIF confirma 155 semnale, reconciliere AI identica
- E5 STABILIZARE: formule auto-aplicate pe randuri noi, tabel structurat
- E6 CONFIRMARE: predare cu aparatura completa catre C03
</commit_message>
<xml_diff>
--- a/c02/FILM-Excel-02-Control.docx
+++ b/c02/FILM-Excel-02-Control.docx
@@ -901,7 +901,7 @@
           <w:rFonts w:ascii="Calibri" w:hAnsi="Calibri"/>
           <w:sz w:val="20"/>
         </w:rPr>
-        <w:t>Recunoastere si control. Nu inventam, urmarim fenomenul.</w:t>
+        <w:t>Suspiciune metodica. Setul pare valid. Nomenclatoarele nu au votat inca.</w:t>
       </w:r>
     </w:p>
     <w:p>
@@ -927,7 +927,7 @@
           <w:i/>
           <w:sz w:val="20"/>
         </w:rPr>
-        <w:t>„Etapa 1: realitate. Nu construim mai mult decat e necesar."</w:t>
+        <w:t>„Preiau setul de la C01. Structural e curat. Acum il confrunt cu realitatea: nomenclatoare, calendare, reguli de categorie. Deschid cele 5 nomenclatoare de referinta."</w:t>
       </w:r>
     </w:p>
     <w:p>
@@ -952,7 +952,7 @@
           <w:rFonts w:ascii="Calibri" w:hAnsi="Calibri"/>
           <w:sz w:val="20"/>
         </w:rPr>
-        <w:t>Pe ecran: actiunile concrete ale etapei 1. Cursorul navigheaza, AI raporteaza, datele se schimba controlat.</w:t>
+        <w:t>Pe ecran: deschidem Date_MASTER-C02.xlsx. Parcurgem cele 5 nomenclatoare — LOCALITATI, COTE_TVA, SCADENTE, ZILE_LUCRATOARE, CNP_REGULI. Cream 5 coloane noi goale: ORAS_OK, TVA_OK, SCADENTA_OK, ZI_LUCRATOARE_OK, CNP_OK. Martorul fixat: suma 7.986.019,38 lei, 2.000 randuri.</w:t>
       </w:r>
     </w:p>
     <w:p>
@@ -977,7 +977,7 @@
           <w:rFonts w:ascii="Calibri" w:hAnsi="Calibri"/>
           <w:sz w:val="20"/>
         </w:rPr>
-        <w:t>AI propune, noi confirmam. Niciun pas neexplicit.</w:t>
+        <w:t>AI scaneaza cele 5 coloane de validat si identifica prima categorie de anomalie — orasele care nu se potrivesc cu nomenclatorul judetean. Nicio valoare nu a fost atinsa.</w:t>
       </w:r>
     </w:p>
     <w:p>
@@ -1002,7 +1002,7 @@
           <w:rFonts w:ascii="Calibri" w:hAnsi="Calibri"/>
           <w:sz w:val="20"/>
         </w:rPr>
-        <w:t>Confirmam controlul: 'Etapa 1 confirmata. Predam mai departe.'</w:t>
+        <w:t>„Suma de control fixata. Nomenclatoarele deschise. Nicio valoare nu a fost atinsa. Aparatura de confruntare — pregatita."</w:t>
       </w:r>
     </w:p>
     <w:p>
@@ -1027,7 +1027,7 @@
           <w:rFonts w:ascii="Calibri" w:hAnsi="Calibri"/>
           <w:sz w:val="20"/>
         </w:rPr>
-        <w:t>Pe ecran: efectul etapei 1 vizibil. Fenomenul recunoscut, transformat sau verificat.</w:t>
+        <w:t>Pe ecran: setul cu 5 coloane noi goale asteptand semnalele. Aparatura pregatita.</w:t>
       </w:r>
     </w:p>
     <w:p>
@@ -1114,7 +1114,7 @@
           <w:rFonts w:ascii="Calibri" w:hAnsi="Calibri"/>
           <w:sz w:val="20"/>
         </w:rPr>
-        <w:t>Recunoastere si control. Nu inventam, urmarim fenomenul.</w:t>
+        <w:t>Atentie la discrepante. Fiecare coloana vorbeste cu nomenclatorul ei.</w:t>
       </w:r>
     </w:p>
     <w:p>
@@ -1140,7 +1140,7 @@
           <w:i/>
           <w:sz w:val="20"/>
         </w:rPr>
-        <w:t>„Etapa 2: investigatie. Nu construim mai mult decat e necesar."</w:t>
+        <w:t>„Nu caut erori. Cer dovezi. Promptul 1 interogheaza setul pe cinci categorii: ce valori par valide dar nu se potrivesc cu realitatea?"</w:t>
       </w:r>
     </w:p>
     <w:p>
@@ -1165,7 +1165,7 @@
           <w:rFonts w:ascii="Calibri" w:hAnsi="Calibri"/>
           <w:sz w:val="20"/>
         </w:rPr>
-        <w:t>Pe ecran: actiunile concrete ale etapei 2. Cursorul navigheaza, AI raporteaza, datele se schimba controlat.</w:t>
+        <w:t>Pe ecran: lipim promptul de audit in Copilot. AI citeste setul si nomenclatoarele. Raportul apare: 50 orase nealiniate, 35 cote TVA ilegale, 25 scadente incorecte, 20 zile nelucratoare, 25 CNP contradictorii. Total: ~155 semnale potentiale.</w:t>
       </w:r>
     </w:p>
     <w:p>
@@ -1190,7 +1190,7 @@
           <w:rFonts w:ascii="Calibri" w:hAnsi="Calibri"/>
           <w:sz w:val="20"/>
         </w:rPr>
-        <w:t>AI propune, noi confirmam. Niciun pas neexplicit.</w:t>
+        <w:t>AI nu repara nimic. Listeaza fiecare anomalie cu coloana, valoarea si regula incalcata. Noi citim raportul si confirmam cele cinci categorii inainte de a construi formulele.</w:t>
       </w:r>
     </w:p>
     <w:p>
@@ -1215,7 +1215,7 @@
           <w:rFonts w:ascii="Calibri" w:hAnsi="Calibri"/>
           <w:sz w:val="20"/>
         </w:rPr>
-        <w:t>Confirmam controlul: 'Etapa 2 confirmata. Predam mai departe.'</w:t>
+        <w:t>„155 potentiale anomalii pe cinci categorii. Zero valori modificate. Acum scriu dovada in formule."</w:t>
       </w:r>
     </w:p>
     <w:p>
@@ -1240,7 +1240,7 @@
           <w:rFonts w:ascii="Calibri" w:hAnsi="Calibri"/>
           <w:sz w:val="20"/>
         </w:rPr>
-        <w:t>Pe ecran: efectul etapei 2 vizibil. Fenomenul recunoscut, transformat sau verificat.</w:t>
+        <w:t>Pe ecran: raportul AI cu cele cinci categorii cuantificate. Prima data vedem ce se ascunde in spatele validitatii aparente.</w:t>
       </w:r>
     </w:p>
     <w:p>
@@ -1327,7 +1327,7 @@
           <w:rFonts w:ascii="Calibri" w:hAnsi="Calibri"/>
           <w:sz w:val="20"/>
         </w:rPr>
-        <w:t>Recunoastere si control. Nu inventam, urmarim fenomenul.</w:t>
+        <w:t>Precizie de formula. COUNTIF, XLOOKUP, NETWORKDAYS nu presupun. Calculeaza si returneaza.</w:t>
       </w:r>
     </w:p>
     <w:p>
@@ -1353,7 +1353,7 @@
           <w:i/>
           <w:sz w:val="20"/>
         </w:rPr>
-        <w:t>„Etapa 3: transformare. Nu construim mai mult decat e necesar."</w:t>
+        <w:t>„Promptul 2 construieste aparatul de semnalizare: COUNTIF pentru orase, XLOOKUP pentru TVA, comparatie de date pentru scadente, NETWORKDAYS.INTL pentru zile lucratoare, logica CNP pentru coduri."</w:t>
       </w:r>
     </w:p>
     <w:p>
@@ -1378,7 +1378,7 @@
           <w:rFonts w:ascii="Calibri" w:hAnsi="Calibri"/>
           <w:sz w:val="20"/>
         </w:rPr>
-        <w:t>Pe ecran: actiunile concrete ale etapei 3. Cursorul navigheaza, AI raporteaza, datele se schimba controlat.</w:t>
+        <w:t>Pe ecran: formulele apar una cate una in coloanele de semnalizare. XLOOKUP returneaza cota_TVA_corecta din nomenclator si o compara cu cota_TVA din set — daca difera: DE VERIFICAT. Valorile sursa raman intacte pe tot parcursul.</w:t>
       </w:r>
     </w:p>
     <w:p>
@@ -1403,7 +1403,7 @@
           <w:rFonts w:ascii="Calibri" w:hAnsi="Calibri"/>
           <w:sz w:val="20"/>
         </w:rPr>
-        <w:t>AI propune, noi confirmam. Niciun pas neexplicit.</w:t>
+        <w:t>AI propune formula pentru fiecare categorie, explica logica, noi confirmam parametrii — nomenclatorul corect, coloana corecta, valoarea de control corecta.</w:t>
       </w:r>
     </w:p>
     <w:p>
@@ -1428,7 +1428,7 @@
           <w:rFonts w:ascii="Calibri" w:hAnsi="Calibri"/>
           <w:sz w:val="20"/>
         </w:rPr>
-        <w:t>Confirmam controlul: 'Etapa 3 confirmata. Predam mai departe.'</w:t>
+        <w:t>„Aparatul de semnalizare construit pe cinci categorii. Suma sursa neatinsa. Semnalele sunt scrise in coloane noi."</w:t>
       </w:r>
     </w:p>
     <w:p>
@@ -1453,7 +1453,7 @@
           <w:rFonts w:ascii="Calibri" w:hAnsi="Calibri"/>
           <w:sz w:val="20"/>
         </w:rPr>
-        <w:t>Pe ecran: efectul etapei 3 vizibil. Fenomenul recunoscut, transformat sau verificat.</w:t>
+        <w:t>Pe ecran: coloanele cu semnale DE VERIFICAT / EXCLUS populate. Valorile sursa intacte. Anomaliile — semnalizate cu dovada formulei.</w:t>
       </w:r>
     </w:p>
     <w:p>
@@ -1540,7 +1540,7 @@
           <w:rFonts w:ascii="Calibri" w:hAnsi="Calibri"/>
           <w:sz w:val="20"/>
         </w:rPr>
-        <w:t>Recunoastere si control. Nu inventam, urmarim fenomenul.</w:t>
+        <w:t>Rigoare matematica. COUNTIF pe semnale nu greseste.</w:t>
       </w:r>
     </w:p>
     <w:p>
@@ -1566,7 +1566,7 @@
           <w:i/>
           <w:sz w:val="20"/>
         </w:rPr>
-        <w:t>„Etapa 4: verificare. Nu construim mai mult decat e necesar."</w:t>
+        <w:t>„COUNTIF pe fiecare coloana de semnalizare confirma cate anomalii am primit in fiecare categorie. Reconciliem cu raportul AI."</w:t>
       </w:r>
     </w:p>
     <w:p>
@@ -1591,7 +1591,7 @@
           <w:rFonts w:ascii="Calibri" w:hAnsi="Calibri"/>
           <w:sz w:val="20"/>
         </w:rPr>
-        <w:t>Pe ecran: actiunile concrete ale etapei 4. Cursorul navigheaza, AI raporteaza, datele se schimba controlat.</w:t>
+        <w:t>Pe ecran: =COUNTIF(ORAS_OK,"DE VERIFICAT") → 50. =COUNTIF(TVA_OK,"DE VERIFICAT") → 35. =COUNTIF(SCADENTA_OK,"EXCLUS") → 25. =COUNTIF(ZI_LUC,"EXCLUS") → 20. =COUNTIF(CNP_OK,"DE VERIFICAT") → 25. Total semnale: 155. Egal cu raportul AI.</w:t>
       </w:r>
     </w:p>
     <w:p>
@@ -1616,7 +1616,7 @@
           <w:rFonts w:ascii="Calibri" w:hAnsi="Calibri"/>
           <w:sz w:val="20"/>
         </w:rPr>
-        <w:t>AI propune, noi confirmam. Niciun pas neexplicit.</w:t>
+        <w:t>AI citeste COUNTIF-urile si confirma ca semnalele corespund anomaliilor identificate. Fiecare categorie — reconciliata.</w:t>
       </w:r>
     </w:p>
     <w:p>
@@ -1641,7 +1641,7 @@
           <w:rFonts w:ascii="Calibri" w:hAnsi="Calibri"/>
           <w:sz w:val="20"/>
         </w:rPr>
-        <w:t>Confirmam controlul: 'Etapa 4 confirmata. Predam mai departe.'</w:t>
+        <w:t>„155 semnale confirmate pe cinci categorii. Reconciliere AI ↔ COUNTIF: identice. Suma sursa conservata 7.986.019,38 lei."</w:t>
       </w:r>
     </w:p>
     <w:p>
@@ -1666,7 +1666,7 @@
           <w:rFonts w:ascii="Calibri" w:hAnsi="Calibri"/>
           <w:sz w:val="20"/>
         </w:rPr>
-        <w:t>Pe ecran: efectul etapei 4 vizibil. Fenomenul recunoscut, transformat sau verificat.</w:t>
+        <w:t>Pe ecran: tabelul de reconciliere — randul AI vs. randul COUNTIF pe fiecare categorie, toate identice. Aparatura de control, functionala.</w:t>
       </w:r>
     </w:p>
     <w:p>
@@ -1753,7 +1753,7 @@
           <w:rFonts w:ascii="Calibri" w:hAnsi="Calibri"/>
           <w:sz w:val="20"/>
         </w:rPr>
-        <w:t>Recunoastere si control. Nu inventam, urmarim fenomenul.</w:t>
+        <w:t>Constructie durabila. Formula aplicata azi se aplica singura pe orice export nou.</w:t>
       </w:r>
     </w:p>
     <w:p>
@@ -1779,7 +1779,7 @@
           <w:i/>
           <w:sz w:val="20"/>
         </w:rPr>
-        <w:t>„Etapa 5: stabilizare. Nu construim mai mult decat e necesar."</w:t>
+        <w:t>„Tabelul structurat ancoreaza formulele. Orice rand nou primeste aceeasi confruntare cu realitatea, fara sa repar manual."</w:t>
       </w:r>
     </w:p>
     <w:p>
@@ -1804,7 +1804,7 @@
           <w:rFonts w:ascii="Calibri" w:hAnsi="Calibri"/>
           <w:sz w:val="20"/>
         </w:rPr>
-        <w:t>Pe ecran: actiunile concrete ale etapei 5. Cursorul navigheaza, AI raporteaza, datele se schimba controlat.</w:t>
+        <w:t>Pe ecran: adaugam un rand test cu un oras neexistent in nomenclator. XLOOKUP returneaza imediat semnalul DE VERIFICAT fara nicio interventie. Formulele sunt vii.</w:t>
       </w:r>
     </w:p>
     <w:p>
@@ -1829,7 +1829,7 @@
           <w:rFonts w:ascii="Calibri" w:hAnsi="Calibri"/>
           <w:sz w:val="20"/>
         </w:rPr>
-        <w:t>AI propune, noi confirmam. Niciun pas neexplicit.</w:t>
+        <w:t>AI confirma ca formulele se auto-aplica pe randuri noi. Nicio interventie manuala pentru confruntare — orice export nou intra direct in sistemul de validare.</w:t>
       </w:r>
     </w:p>
     <w:p>
@@ -1854,7 +1854,7 @@
           <w:rFonts w:ascii="Calibri" w:hAnsi="Calibri"/>
           <w:sz w:val="20"/>
         </w:rPr>
-        <w:t>Confirmam controlul: 'Etapa 5 confirmata. Predam mai departe.'</w:t>
+        <w:t>„Randul nou a primit semnalele corecte fara interventie. Formulele se auto-aplica. Suma de control — conservata."</w:t>
       </w:r>
     </w:p>
     <w:p>
@@ -1879,7 +1879,7 @@
           <w:rFonts w:ascii="Calibri" w:hAnsi="Calibri"/>
           <w:sz w:val="20"/>
         </w:rPr>
-        <w:t>Pe ecran: efectul etapei 5 vizibil. Fenomenul recunoscut, transformat sau verificat.</w:t>
+        <w:t>Pe ecran: formulele propagate pe randul test. Sistemul de confruntare activ fara interventie manuala.</w:t>
       </w:r>
     </w:p>
     <w:p>
@@ -1966,7 +1966,7 @@
           <w:rFonts w:ascii="Calibri" w:hAnsi="Calibri"/>
           <w:sz w:val="20"/>
         </w:rPr>
-        <w:t>Recunoastere si control. Nu inventam, urmarim fenomenul.</w:t>
+        <w:t>Predare cu dovada. Setul nu mai e doar valid — e confruntat.</w:t>
       </w:r>
     </w:p>
     <w:p>
@@ -1992,7 +1992,7 @@
           <w:i/>
           <w:sz w:val="20"/>
         </w:rPr>
-        <w:t>„Etapa 6: confirmare. Nu construim mai mult decat e necesar."</w:t>
+        <w:t>„Predau setul cu aparatura de semnalizare completa. 155 anomalii documentate, semnalizate, verificate. Zero valori sursa modificate."</w:t>
       </w:r>
     </w:p>
     <w:p>
@@ -2017,7 +2017,7 @@
           <w:rFonts w:ascii="Calibri" w:hAnsi="Calibri"/>
           <w:sz w:val="20"/>
         </w:rPr>
-        <w:t>Pe ecran: actiunile concrete ale etapei 6. Cursorul navigheaza, AI raporteaza, datele se schimba controlat.</w:t>
+        <w:t>Pe ecran: setul final cu coloanele de semnalizare populate: ORAS_OK, TVA_OK, SCADENTA_OK, ZI_LUCRATOARE_OK, CNP_OK, flag, status_validare, motiv_anomalie. Suma 7.986.019,38 lei — conservata.</w:t>
       </w:r>
     </w:p>
     <w:p>
@@ -2042,7 +2042,7 @@
           <w:rFonts w:ascii="Calibri" w:hAnsi="Calibri"/>
           <w:sz w:val="20"/>
         </w:rPr>
-        <w:t>AI propune, noi confirmam. Niciun pas neexplicit.</w:t>
+        <w:t>AI rezuma: 155 semnale pe 5 categorii, zero valori sursa modificate, nomenclatoarele raman separate si actualizabile pentru exporturile viitoare.</w:t>
       </w:r>
     </w:p>
     <w:p>
@@ -2067,7 +2067,7 @@
           <w:rFonts w:ascii="Calibri" w:hAnsi="Calibri"/>
           <w:sz w:val="20"/>
         </w:rPr>
-        <w:t>Confirmam controlul: 'Etapa 6 confirmata. Predam mai departe.'</w:t>
+        <w:t>„Suma conservata. 155 semnale documentate. Aparatura activa. Predam catre C03."</w:t>
       </w:r>
     </w:p>
     <w:p>
@@ -2092,7 +2092,7 @@
           <w:rFonts w:ascii="Calibri" w:hAnsi="Calibri"/>
           <w:sz w:val="20"/>
         </w:rPr>
-        <w:t>Pe ecran: efectul etapei 6 vizibil. Fenomenul recunoscut, transformat sau verificat.</w:t>
+        <w:t>Setul controlat predat. Nu a fost reconstruit — a fost confruntat cu realitatea.</w:t>
       </w:r>
     </w:p>
     <w:p>

</xml_diff>

<commit_message>
fix(BRAIN-002): inchidere 3 reziduuri T1 FILM (slide exec C03, ROLURI C02, CONTROL UMAN C04)
- C03: slide exec 2+6 de-clonate fata de C01 (C01 neatins)
- C02: linie ROLURI reziduala de executie eliminata
- C04: ecou motto C01 inlocuit cu limbaj axei (Applied Step/Refresh/flux)
- corpul narativ 6x6 + AHA/MANTRA/WOW/MOTTO locked neatinse
- audit_sync ZERO DRIFT 123/144

https://claude.ai/code/session_018dtScvBDuX38jSGHtyeXmZ
</commit_message>
<xml_diff>
--- a/c02/FILM-Excel-02-Control.docx
+++ b/c02/FILM-Excel-02-Control.docx
@@ -617,18 +617,6 @@
           <w:sz w:val="22"/>
         </w:rPr>
         <w:t>AI (Copilot)</w:t>
-      </w:r>
-    </w:p>
-    <w:p>
-      <w:pPr>
-        <w:spacing w:after="80"/>
-      </w:pPr>
-      <w:r>
-        <w:rPr>
-          <w:rFonts w:ascii="Calibri" w:hAnsi="Calibri"/>
-          <w:sz w:val="20"/>
-        </w:rPr>
-        <w:t>Audit + executie controlata. Raporteaza ce vede, aplica transformari cerute explicit de noi.</w:t>
       </w:r>
     </w:p>
     <w:p>

</xml_diff>